<commit_message>
Snacks and supplies fee back to $60, shown per semester
Co-Authored-By: Claude Opus 5.5 <noreply@anthropic.com>
</commit_message>
<xml_diff>
--- a/docs/KDO-Parent-Handbook.docx
+++ b/docs/KDO-Parent-Handbook.docx
@@ -299,7 +299,7 @@
         <w:pStyle w:val="FirstParagraph"/>
       </w:pPr>
       <w:r>
-        <w:t xml:space="preserve">There is one $65 non-refundable snacks and supplies fee per child for each semester. It covers snacks, wipes, and craft materials, and it is split evenly across your monthly payments.</w:t>
+        <w:t xml:space="preserve">There is one $60 non-refundable snacks and supplies fee per child for each semester. It covers snacks, wipes, and craft materials, and it is spread over your monthly payments.</w:t>
       </w:r>
     </w:p>
     <w:bookmarkEnd w:id="17"/>
@@ -367,7 +367,7 @@
         <w:pStyle w:val="FirstParagraph"/>
       </w:pPr>
       <w:r>
-        <w:t xml:space="preserve">Tuition is paid monthly. The January through April payments each cover 4 Thursdays, plus $13 toward the snacks and supplies fee. May covers the last 2 Thursdays, so it is smaller.</w:t>
+        <w:t xml:space="preserve">Tuition is paid monthly. The January through April payments each cover 4 Thursdays, plus $12 toward the snacks and supplies fee. May covers the last 2 Thursdays, so it is smaller.</w:t>
       </w:r>
     </w:p>
     <w:p>
@@ -379,7 +379,7 @@
         </w:numPr>
       </w:pPr>
       <w:r>
-        <w:t xml:space="preserve">Toddlers and preschool: $20 x 4 Thursdays + $13 = $93 a month, and $53 in May</w:t>
+        <w:t xml:space="preserve">Toddlers and preschool: $20 x 4 Thursdays + $12 = $92 a month, and $52 in May</w:t>
       </w:r>
     </w:p>
     <w:p>
@@ -391,15 +391,15 @@
         </w:numPr>
       </w:pPr>
       <w:r>
-        <w:t xml:space="preserve">Babies: $25 x 4 Thursdays + $13 = $113 a month, and $63 in May</w:t>
-      </w:r>
-    </w:p>
-    <w:p>
-      <w:pPr>
-        <w:pStyle w:val="FirstParagraph"/>
-      </w:pPr>
-      <w:r>
-        <w:t xml:space="preserve">For the whole semester (18 Thursdays), that is $425 for a toddler or preschooler and $515 for a baby.</w:t>
+        <w:t xml:space="preserve">Babies: $25 x 4 Thursdays + $12 = $112 a month, and $62 in May</w:t>
+      </w:r>
+    </w:p>
+    <w:p>
+      <w:pPr>
+        <w:pStyle w:val="FirstParagraph"/>
+      </w:pPr>
+      <w:r>
+        <w:t xml:space="preserve">For the whole semester (18 Thursdays), that is $420 for a toddler or preschooler and $510 for a baby.</w:t>
       </w:r>
     </w:p>
     <w:bookmarkEnd w:id="19"/>

</xml_diff>